<commit_message>
docs(readme) >> I edited the documents, removing the mobile section and leaving only the desktop section
</commit_message>
<xml_diff>
--- a/Documentação/1 - TAP/V1.0/Termo de Abertura de Projeto - Monevo.docx
+++ b/Documentação/1 - TAP/V1.0/Termo de Abertura de Projeto - Monevo.docx
@@ -1412,30 +1412,6 @@
     </w:p>
     <w:p>
       <w:pPr>
-        <w:numPr>
-          <w:ilvl w:val="0"/>
-          <w:numId w:val="5"/>
-        </w:numPr>
-        <w:spacing w:after="100" w:afterAutospacing="1" w:line="240" w:lineRule="auto"/>
-        <w:rPr>
-          <w:rFonts w:ascii="Cambria" w:eastAsia="Times New Roman" w:hAnsi="Cambria" w:cstheme="majorHAnsi"/>
-          <w:sz w:val="24"/>
-          <w:szCs w:val="24"/>
-          <w:lang w:eastAsia="pt-BR"/>
-        </w:rPr>
-      </w:pPr>
-      <w:r>
-        <w:rPr>
-          <w:rFonts w:ascii="Cambria" w:eastAsia="Times New Roman" w:hAnsi="Cambria" w:cstheme="majorHAnsi"/>
-          <w:sz w:val="24"/>
-          <w:szCs w:val="24"/>
-          <w:lang w:eastAsia="pt-BR"/>
-        </w:rPr>
-        <w:t>Desenvolvimento de versões para múltiplas plataformas além da web (ex: desktop standalone, app nativo Android/iOS, além do web/mobile).</w:t>
-      </w:r>
-    </w:p>
-    <w:p>
-      <w:pPr>
         <w:spacing w:after="100" w:afterAutospacing="1" w:line="240" w:lineRule="auto"/>
         <w:jc w:val="both"/>
         <w:outlineLvl w:val="3"/>
@@ -1808,7 +1784,7 @@
           <w:szCs w:val="24"/>
           <w:lang w:eastAsia="pt-BR"/>
         </w:rPr>
-        <w:t>Ambiente para testes (dispositivos móveis e desktop).</w:t>
+        <w:t>Ambiente para testes (dispositivo desktop).</w:t>
       </w:r>
     </w:p>
     <w:p>
@@ -1979,7 +1955,6 @@
           <w:szCs w:val="24"/>
           <w:lang w:eastAsia="pt-BR"/>
         </w:rPr>
-        <w:lastRenderedPageBreak/>
         <w:t>Possível investimento em hardware para testes (smartphones, computadores).</w:t>
       </w:r>
     </w:p>
@@ -2006,6 +1981,7 @@
           <w:szCs w:val="24"/>
           <w:lang w:eastAsia="pt-BR"/>
         </w:rPr>
+        <w:lastRenderedPageBreak/>
         <w:t>7</w:t>
       </w:r>
       <w:r>
@@ -2667,7 +2643,6 @@
           <w:szCs w:val="24"/>
           <w:lang w:eastAsia="pt-BR"/>
         </w:rPr>
-        <w:lastRenderedPageBreak/>
         <w:t>10</w:t>
       </w:r>
       <w:r>

</xml_diff>